<commit_message>
added supreme court data
</commit_message>
<xml_diff>
--- a/docs/dataForTaining/type of data.docx
+++ b/docs/dataForTaining/type of data.docx
@@ -12,19 +12,19 @@
           <w:bCs/>
           <w:sz w:val="27"/>
           <w:szCs w:val="27"/>
-          <w:lang w:val="en-PK" w:eastAsia="en-PK"/>
+          <w:lang w:eastAsia="en-PK"/>
         </w:rPr>
       </w:pPr>
       <w:r>
         <w:rPr>
-          <w:rFonts w:ascii="Segoe UI Emoji" w:eastAsia="Times New Roman" w:hAnsi="Segoe UI Emoji" w:cs="Segoe UI Emoji"/>
+          <w:rFonts w:ascii="Times New Roman" w:eastAsia="Times New Roman" w:hAnsi="Times New Roman" w:cs="Times New Roman"/>
           <w:b/>
           <w:bCs/>
           <w:sz w:val="27"/>
           <w:szCs w:val="27"/>
-          <w:lang w:val="en-PK" w:eastAsia="en-PK"/>
-        </w:rPr>
-        <w:t>🏛</w:t>
+          <w:lang w:eastAsia="en-PK"/>
+        </w:rPr>
+        <w:t>1. Core Legal Text Data (</w:t>
       </w:r>
       <w:r>
         <w:rPr>
@@ -33,9 +33,20 @@
           <w:bCs/>
           <w:sz w:val="27"/>
           <w:szCs w:val="27"/>
-          <w:lang w:val="en-PK" w:eastAsia="en-PK"/>
-        </w:rPr>
-        <w:t>️ 1. Core Legal Text Data (Knowledge Base)</w:t>
+          <w:lang w:val="en-US" w:eastAsia="en-PK"/>
+        </w:rPr>
+        <w:t>property law</w:t>
+      </w:r>
+      <w:r>
+        <w:rPr>
+          <w:rFonts w:ascii="Times New Roman" w:eastAsia="Times New Roman" w:hAnsi="Times New Roman" w:cs="Times New Roman"/>
+          <w:b/>
+          <w:bCs/>
+          <w:sz w:val="27"/>
+          <w:szCs w:val="27"/>
+          <w:lang w:eastAsia="en-PK"/>
+        </w:rPr>
+        <w:t>)</w:t>
       </w:r>
     </w:p>
     <w:p>
@@ -48,13 +59,7 @@
         </w:rPr>
       </w:pPr>
       <w:r>
-        <w:rPr>
-          <w:rFonts w:ascii="Segoe UI Emoji" w:hAnsi="Segoe UI Emoji" w:cs="Segoe UI Emoji"/>
-        </w:rPr>
-        <w:t>💬</w:t>
-      </w:r>
-      <w:r>
-        <w:t xml:space="preserve"> 2. </w:t>
+        <w:t xml:space="preserve">2. </w:t>
       </w:r>
       <w:r>
         <w:rPr>
@@ -119,8 +124,48 @@
           <w:bCs/>
           <w:lang w:val="en-US"/>
         </w:rPr>
-        <w:t xml:space="preserve"> data</w:t>
-      </w:r>
+        <w:t xml:space="preserve"> </w:t>
+      </w:r>
+      <w:r>
+        <w:rPr>
+          <w:rStyle w:val="Strong"/>
+          <w:b/>
+          <w:bCs/>
+          <w:lang w:val="en-US"/>
+        </w:rPr>
+        <w:t>data</w:t>
+      </w:r>
+    </w:p>
+    <w:p>
+      <w:pPr>
+        <w:pStyle w:val="Heading3"/>
+        <w:rPr>
+          <w:rStyle w:val="Strong"/>
+          <w:b/>
+          <w:bCs/>
+          <w:lang w:val="en-US"/>
+        </w:rPr>
+      </w:pPr>
+      <w:r>
+        <w:rPr>
+          <w:rStyle w:val="Strong"/>
+          <w:b/>
+          <w:bCs/>
+          <w:lang w:val="en-US"/>
+        </w:rPr>
+        <w:t xml:space="preserve">4. legal </w:t>
+      </w:r>
+      <w:proofErr w:type="spellStart"/>
+      <w:r>
+        <w:rPr>
+          <w:rStyle w:val="Strong"/>
+          <w:b/>
+          <w:bCs/>
+          <w:lang w:val="en-US"/>
+        </w:rPr>
+        <w:t>uqad</w:t>
+      </w:r>
+      <w:proofErr w:type="spellEnd"/>
     </w:p>
     <w:p>
       <w:pPr>
@@ -556,7 +601,7 @@
       <w:bCs/>
       <w:sz w:val="27"/>
       <w:szCs w:val="27"/>
-      <w:lang w:val="en-PK" w:eastAsia="en-PK"/>
+      <w:lang w:eastAsia="en-PK"/>
     </w:rPr>
   </w:style>
   <w:style w:type="character" w:default="1" w:styleId="DefaultParagraphFont">

</xml_diff>